<commit_message>
fix(docx): finalize shared spacing guards (fb-595.54.8)
Gate: run-1029023423-86638 34af76757b637267193d4d34209d073d571a8113
</commit_message>
<xml_diff>
--- a/courts/eighth-circuit/arkansas/state/court-of-appeals/amicus-brief/usage/OUTPUT-amicus-brief.docx
+++ b/courts/eighth-circuit/arkansas/state/court-of-appeals/amicus-brief/usage/OUTPUT-amicus-brief.docx
@@ -27,11 +27,7 @@
           <w:b/>
           <w:bCs/>
         </w:rPr>
-        <w:t xml:space="preserve">CV</w:t>
-        <w:noBreakHyphen/>
-        <w:t xml:space="preserve">24</w:t>
-        <w:noBreakHyphen/>
-        <w:t xml:space="preserve">54</w:t>
+        <w:t xml:space="preserve">CV-⁠24-⁠54</w:t>
       </w:r>
     </w:p>
     <w:p>
@@ -323,11 +319,7 @@
         <w:t xml:space="preserve"> </w:t>
       </w:r>
       <w:r>
-        <w:t xml:space="preserve">10CV</w:t>
-        <w:noBreakHyphen/>
-        <w:t xml:space="preserve">17</w:t>
-        <w:noBreakHyphen/>
-        <w:t xml:space="preserve">28</w:t>
+        <w:t xml:space="preserve">10CV-⁠17-⁠28</w:t>
       </w:r>
     </w:p>
     <w:p>
@@ -651,9 +643,7 @@
         <w:t xml:space="preserve"> </w:t>
       </w:r>
       <w:r>
-        <w:t xml:space="preserve">372</w:t>
-        <w:noBreakHyphen/>
-        <w:t xml:space="preserve">7947</w:t>
+        <w:t xml:space="preserve">372-⁠7947</w:t>
       </w:r>
     </w:p>
     <w:p>
@@ -1762,11 +1752,7 @@
         <w:t xml:space="preserve"> </w:t>
       </w:r>
       <w:r>
-        <w:t xml:space="preserve">12</w:t>
-        <w:noBreakHyphen/>
-        <w:t xml:space="preserve">10</w:t>
-        <w:noBreakHyphen/>
-        <w:t xml:space="preserve">301</w:t>
+        <w:t xml:space="preserve">12-⁠10-⁠301</w:t>
       </w:r>
       <w:r>
         <w:t xml:space="preserve">   </w:t>
@@ -1812,11 +1798,7 @@
         <w:t xml:space="preserve"> </w:t>
       </w:r>
       <w:r>
-        <w:t xml:space="preserve">12</w:t>
-        <w:noBreakHyphen/>
-        <w:t xml:space="preserve">10</w:t>
-        <w:noBreakHyphen/>
-        <w:t xml:space="preserve">302</w:t>
+        <w:t xml:space="preserve">12-⁠10-⁠302</w:t>
       </w:r>
       <w:r>
         <w:t xml:space="preserve">   </w:t>
@@ -1862,11 +1844,7 @@
         <w:t xml:space="preserve"> </w:t>
       </w:r>
       <w:r>
-        <w:t xml:space="preserve">12</w:t>
-        <w:noBreakHyphen/>
-        <w:t xml:space="preserve">10</w:t>
-        <w:noBreakHyphen/>
-        <w:t xml:space="preserve">303</w:t>
+        <w:t xml:space="preserve">12-⁠10-⁠303</w:t>
       </w:r>
       <w:r>
         <w:t xml:space="preserve">   </w:t>
@@ -1912,11 +1890,7 @@
         <w:t xml:space="preserve"> </w:t>
       </w:r>
       <w:r>
-        <w:t xml:space="preserve">14</w:t>
-        <w:noBreakHyphen/>
-        <w:t xml:space="preserve">20</w:t>
-        <w:noBreakHyphen/>
-        <w:t xml:space="preserve">107</w:t>
+        <w:t xml:space="preserve">14-⁠20-⁠107</w:t>
       </w:r>
       <w:r>
         <w:t xml:space="preserve">   </w:t>
@@ -2729,13 +2703,7 @@
         <w:t xml:space="preserve"> </w:t>
       </w:r>
       <w:r>
-        <w:t xml:space="preserve">(Appellants’ Brief 18</w:t>
-      </w:r>
-      <w:r>
-        <w:noBreakHyphen/>
-      </w:r>
-      <w:r>
-        <w:t xml:space="preserve">19). Counties also enjoy exemptions from county/​municipal taxes and from utility franchise assessments, thus counties are exempt from the 911 fee because counties are</w:t>
+        <w:t xml:space="preserve">(Appellants’ Brief 18-⁠19). Counties also enjoy exemptions from county/​municipal taxes and from utility franchise assessments, thus counties are exempt from the 911 fee because counties are</w:t>
       </w:r>
       <w:r>
         <w:t xml:space="preserve"> </w:t>
@@ -2757,13 +2725,7 @@
         <w:t xml:space="preserve"> </w:t>
       </w:r>
       <w:r>
-        <w:t xml:space="preserve">(Appellants’ Brief 20</w:t>
-      </w:r>
-      <w:r>
-        <w:noBreakHyphen/>
-      </w:r>
-      <w:r>
-        <w:t xml:space="preserve">25).</w:t>
+        <w:t xml:space="preserve">(Appellants’ Brief 20-⁠25).</w:t>
       </w:r>
     </w:p>
     <w:p>
@@ -2851,13 +2813,7 @@
         <w:t xml:space="preserve"> </w:t>
       </w:r>
       <w:r>
-        <w:t xml:space="preserve">(Appellees’ Brief 19</w:t>
-      </w:r>
-      <w:r>
-        <w:noBreakHyphen/>
-      </w:r>
-      <w:r>
-        <w:t xml:space="preserve">21). AT&amp;T’s circular logic conflicts with the list of service users explicitly contained in the statute—</w:t>
+        <w:t xml:space="preserve">(Appellees’ Brief 19-⁠21). AT&amp;T’s circular logic conflicts with the list of service users explicitly contained in the statute—</w:t>
       </w:r>
       <w:r>
         <w:t xml:space="preserve">“any person, company, corporation, business, association, or party”</w:t>
@@ -2928,19 +2884,7 @@
         <w:t xml:space="preserve"> </w:t>
       </w:r>
       <w:r>
-        <w:t xml:space="preserve">under Section 12</w:t>
-      </w:r>
-      <w:r>
-        <w:noBreakHyphen/>
-      </w:r>
-      <w:r>
-        <w:t xml:space="preserve">10</w:t>
-      </w:r>
-      <w:r>
-        <w:noBreakHyphen/>
-      </w:r>
-      <w:r>
-        <w:t xml:space="preserve">303(27).</w:t>
+        <w:t xml:space="preserve">under Section 12-⁠10-⁠303(27).</w:t>
       </w:r>
       <w:r>
         <w:t xml:space="preserve"> </w:t>
@@ -2958,19 +2902,7 @@
         <w:t xml:space="preserve"> </w:t>
       </w:r>
       <w:r>
-        <w:t xml:space="preserve">under Section 12</w:t>
-      </w:r>
-      <w:r>
-        <w:noBreakHyphen/>
-      </w:r>
-      <w:r>
-        <w:t xml:space="preserve">10</w:t>
-      </w:r>
-      <w:r>
-        <w:noBreakHyphen/>
-      </w:r>
-      <w:r>
-        <w:t xml:space="preserve">303(27).</w:t>
+        <w:t xml:space="preserve">under Section 12-⁠10-⁠303(27).</w:t>
       </w:r>
       <w:r>
         <w:t xml:space="preserve"> </w:t>
@@ -3022,13 +2954,7 @@
         <w:t xml:space="preserve"> </w:t>
       </w:r>
       <w:r>
-        <w:t xml:space="preserve">(Appellees’ Brief 21</w:t>
-      </w:r>
-      <w:r>
-        <w:noBreakHyphen/>
-      </w:r>
-      <w:r>
-        <w:t xml:space="preserve">23). AT&amp;T is simply unable to present an argument about the 911 fee that is rooted in the plain language of the statute—giving every word its ordinary meaning (and without additional words). The counties, on the other hand, seek to read and interpret the statute exactly as written—and so should this Court.</w:t>
+        <w:t xml:space="preserve">(Appellees’ Brief 21-⁠23). AT&amp;T is simply unable to present an argument about the 911 fee that is rooted in the plain language of the statute—giving every word its ordinary meaning (and without additional words). The counties, on the other hand, seek to read and interpret the statute exactly as written—and so should this Court.</w:t>
       </w:r>
     </w:p>
     <w:p>
@@ -3168,19 +3094,7 @@
         <w:pStyle w:val="BodyText"/>
       </w:pPr>
       <w:r>
-        <w:t xml:space="preserve">Arkansas counties are 911 service providers, not 911 service users. Counties and county officials and county employees are the backbone of the 911 system. Consistent with their critical role administering the system funded by the 911 service charges—and consistent with the fact that counties are exempt from property taxes and a host of other county and municipal taxes and fees—counties are exempt from the 911 service charge that AT&amp;T has assessed against them in this case under Ark. Code Ann. §12</w:t>
-      </w:r>
-      <w:r>
-        <w:noBreakHyphen/>
-      </w:r>
-      <w:r>
-        <w:t xml:space="preserve">10</w:t>
-      </w:r>
-      <w:r>
-        <w:noBreakHyphen/>
-      </w:r>
-      <w:r>
-        <w:t xml:space="preserve">301</w:t>
+        <w:t xml:space="preserve">Arkansas counties are 911 service providers, not 911 service users. Counties and county officials and county employees are the backbone of the 911 system. Consistent with their critical role administering the system funded by the 911 service charges—and consistent with the fact that counties are exempt from property taxes and a host of other county and municipal taxes and fees—counties are exempt from the 911 service charge that AT&amp;T has assessed against them in this case under Ark. Code Ann. §12-⁠10-⁠301</w:t>
       </w:r>
       <w:r>
         <w:t xml:space="preserve"> </w:t>
@@ -3443,9 +3357,7 @@
               <w:t xml:space="preserve"> </w:t>
             </w:r>
             <w:r>
-              <w:t xml:space="preserve">372</w:t>
-              <w:noBreakHyphen/>
-              <w:t xml:space="preserve">7947</w:t>
+              <w:t xml:space="preserve">372-⁠7947</w:t>
             </w:r>
           </w:p>
           <w:p>
@@ -3920,19 +3832,7 @@
         <w:pStyle w:val="XdTail"/>
       </w:pPr>
       <w:r>
-        <w:t xml:space="preserve">I, Colin R. Jorgensen, hereby certify that this Brief complies with Rule 4</w:t>
-      </w:r>
-      <w:r>
-        <w:noBreakHyphen/>
-      </w:r>
-      <w:r>
-        <w:t xml:space="preserve">1 and Rule 4</w:t>
-      </w:r>
-      <w:r>
-        <w:noBreakHyphen/>
-      </w:r>
-      <w:r>
-        <w:t xml:space="preserve">6 of the Rules of the Supreme Court and Court of Appeals, Administrative Order No. 19 regarding the style of briefs and the redaction of any confidential information, and Administrative Order No. 21, Section 9, regarding hyperlinks to external papers or websites. The PDF document is identical to the corresponding parts of the paper document from which it was created as filed with the Court. To the best of my knowledge, information, and belief formed after scanning the PDF document for viruses with an antivirus program, the PDF document is free of computer viruses.</w:t>
+        <w:t xml:space="preserve">I, Colin R. Jorgensen, hereby certify that this Brief complies with Rule 4-⁠1 and Rule 4-⁠6 of the Rules of the Supreme Court and Court of Appeals, Administrative Order No. 19 regarding the style of briefs and the redaction of any confidential information, and Administrative Order No. 21, Section 9, regarding hyperlinks to external papers or websites. The PDF document is identical to the corresponding parts of the paper document from which it was created as filed with the Court. To the best of my knowledge, information, and belief formed after scanning the PDF document for viruses with an antivirus program, the PDF document is free of computer viruses.</w:t>
       </w:r>
     </w:p>
     <w:p>
@@ -3940,13 +3840,7 @@
         <w:pStyle w:val="XdTail"/>
       </w:pPr>
       <w:r>
-        <w:t xml:space="preserve">This Brief also complies with the word-count limitations in Rule 4</w:t>
-      </w:r>
-      <w:r>
-        <w:noBreakHyphen/>
-      </w:r>
-      <w:r>
-        <w:t xml:space="preserve">6(g) of the Rules of the Supreme Court and Court of Appeals, because it contains 1,356 words, excluding the cover, table of contents, table of authorities, certificate of service, and this certificate of compliance.</w:t>
+        <w:t xml:space="preserve">This Brief also complies with the word-count limitations in Rule 4-⁠6(g) of the Rules of the Supreme Court and Court of Appeals, because it contains 1,356 words, excluding the cover, table of contents, table of authorities, certificate of service, and this certificate of compliance.</w:t>
       </w:r>
     </w:p>
     <w:p>
@@ -4060,19 +3954,7 @@
         <w:t xml:space="preserve"> </w:t>
       </w:r>
       <w:r>
-        <w:t xml:space="preserve">of 2019 passed with overwhelming bipartisan support in the Arkansas House (81</w:t>
-      </w:r>
-      <w:r>
-        <w:noBreakHyphen/>
-      </w:r>
-      <w:r>
-        <w:t xml:space="preserve">5) and Senate (29</w:t>
-      </w:r>
-      <w:r>
-        <w:noBreakHyphen/>
-      </w:r>
-      <w:r>
-        <w:t xml:space="preserve">3).</w:t>
+        <w:t xml:space="preserve">of 2019 passed with overwhelming bipartisan support in the Arkansas House (81-⁠5) and Senate (29-⁠3).</w:t>
       </w:r>
     </w:p>
   </w:footnote>

</xml_diff>